<commit_message>
refactor: refactored documents and files (#27)
Co-authored-by: Copilot <223556219+Copilot@users.noreply.github.com>
</commit_message>
<xml_diff>
--- a/docs/datasheets/Pulsar_Routing_Plan.docx
+++ b/docs/datasheets/Pulsar_Routing_Plan.docx
@@ -6447,7 +6447,7 @@
                 <w:sz w:val="18"/>
                 <w:szCs w:val="18"/>
               </w:rPr>
-              <w:t xml:space="preserve">ADS7042 (×8)</w:t>
+              <w:t xml:space="preserve">AD7689 (×8)</w:t>
             </w:r>
           </w:p>
         </w:tc>
@@ -6480,7 +6480,7 @@
                 <w:sz w:val="18"/>
                 <w:szCs w:val="18"/>
               </w:rPr>
-              <w:t xml:space="preserve">12-bit SAR ADC</w:t>
+              <w:t xml:space="preserve">16-bit SAR ADC</w:t>
             </w:r>
           </w:p>
         </w:tc>
@@ -6513,7 +6513,7 @@
                 <w:sz w:val="18"/>
                 <w:szCs w:val="18"/>
               </w:rPr>
-              <w:t xml:space="preserve">SOT-23-6</w:t>
+              <w:t xml:space="preserve">LFCSP-20</w:t>
             </w:r>
           </w:p>
         </w:tc>
@@ -6546,7 +6546,7 @@
                 <w:sz w:val="18"/>
                 <w:szCs w:val="18"/>
               </w:rPr>
-              <w:t xml:space="preserve">SBAS519 (TI)</w:t>
+              <w:t xml:space="preserve">AD7689 (Analog Devices)</w:t>
             </w:r>
           </w:p>
         </w:tc>
@@ -6614,7 +6614,7 @@
                 <w:sz w:val="18"/>
                 <w:szCs w:val="18"/>
               </w:rPr>
-              <w:t xml:space="preserve">CD74HC4067 (×4)</w:t>
+              <w:t xml:space="preserve">ADG1606 (×4)</w:t>
             </w:r>
           </w:p>
         </w:tc>
@@ -6713,7 +6713,7 @@
                 <w:sz w:val="18"/>
                 <w:szCs w:val="18"/>
               </w:rPr>
-              <w:t xml:space="preserve">SCHS113 (TI)</w:t>
+              <w:t xml:space="preserve">ADG1606 (Analog Devices)</w:t>
             </w:r>
           </w:p>
         </w:tc>
@@ -9926,7 +9926,7 @@
           <w:sz w:val="20"/>
           <w:szCs w:val="20"/>
         </w:rPr>
-        <w:t xml:space="preserve">• Los MUX CD74HC4067 tienen 16 entradas → 1 salida. Las 4 salidas de los MUX van a 4 ADCs.</w:t>
+        <w:t xml:space="preserve">• Los MUX ADG1606 tienen 16 entradas → 1 salida. Las 4 salidas de los MUX van a 8 ADCs (U_ADC0–7).</w:t>
       </w:r>
     </w:p>
     <w:p>
@@ -9942,7 +9942,7 @@
           <w:sz w:val="20"/>
           <w:szCs w:val="20"/>
         </w:rPr>
-        <w:t xml:space="preserve">• Cada ADC ADS7042 necesita traza de entrada &lt; 10 mm desde el buffer.</w:t>
+        <w:t xml:space="preserve">• Cada ADC AD7689 necesita traza de entrada &lt; 10 mm desde el buffer.</w:t>
       </w:r>
     </w:p>
     <w:p>
@@ -11209,7 +11209,7 @@
                 <w:sz w:val="18"/>
                 <w:szCs w:val="18"/>
               </w:rPr>
-              <w:t xml:space="preserve">ADC – ADS7042</w:t>
+              <w:t xml:space="preserve">ADC – AD7689</w:t>
             </w:r>
           </w:p>
         </w:tc>
@@ -11242,7 +11242,7 @@
                 <w:sz w:val="18"/>
                 <w:szCs w:val="18"/>
               </w:rPr>
-              <w:t xml:space="preserve">Datasheet SBAS519</w:t>
+              <w:t xml:space="preserve">Datasheet AD7689</w:t>
             </w:r>
           </w:p>
         </w:tc>
@@ -11272,7 +11272,7 @@
                   <w:sz w:val="16"/>
                   <w:szCs w:val="16"/>
                 </w:rPr>
-                <w:t xml:space="preserve">www.ti.com/lit/ds/symlink/ads7042.pdf</w:t>
+                <w:t xml:space="preserve">Analog Devices — AD7689</w:t>
               </w:r>
             </w:hyperlink>
           </w:p>
@@ -11308,7 +11308,7 @@
                 <w:sz w:val="18"/>
                 <w:szCs w:val="18"/>
               </w:rPr>
-              <w:t xml:space="preserve">Mux – CD74HC4067</w:t>
+              <w:t xml:space="preserve">Mux – ADG1606</w:t>
             </w:r>
           </w:p>
         </w:tc>
@@ -11341,7 +11341,7 @@
                 <w:sz w:val="18"/>
                 <w:szCs w:val="18"/>
               </w:rPr>
-              <w:t xml:space="preserve">Datasheet SCHS113</w:t>
+              <w:t xml:space="preserve">Datasheet ADG1606</w:t>
             </w:r>
           </w:p>
         </w:tc>
@@ -11371,7 +11371,7 @@
                   <w:sz w:val="16"/>
                   <w:szCs w:val="16"/>
                 </w:rPr>
-                <w:t xml:space="preserve">www.ti.com/lit/ds/symlink/cd74hc4067.pdf</w:t>
+                <w:t xml:space="preserve">Analog Devices — ADG1606</w:t>
               </w:r>
             </w:hyperlink>
           </w:p>

</xml_diff>